<commit_message>
Add initial implementation for image restoration and validation notebooks
- Created `run.py` as the main entry point for restoring degraded images using a trained model.
- Added two Jupyter notebooks for validating statistical claims with original and synthesized data.
- Implemented model loading, input file handling, and batch processing for image restoration.
- Included functionality for optional FP16 inference and output comparison grid generation.
</commit_message>
<xml_diff>
--- a/Documents/Research.docx
+++ b/Documents/Research.docx
@@ -668,6 +668,9 @@
         <w:spacing w:before="70" w:after="70"/>
       </w:pPr>
       <w:r>
+        <w:rPr>
+          <w:noProof/>
+        </w:rPr>
         <w:drawing>
           <wp:inline distT="0" distB="0" distL="0" distR="0" wp14:anchorId="6F487AFB" wp14:editId="294AAB86">
             <wp:extent cx="3070860" cy="657860"/>
@@ -716,10 +719,7 @@
         <w:spacing w:before="70" w:after="70"/>
       </w:pPr>
       <w:r>
-        <w:t xml:space="preserve">                                           </w:t>
-      </w:r>
-      <w:r>
-        <w:t>(2)</w:t>
+        <w:t xml:space="preserve">                                           (2)</w:t>
       </w:r>
     </w:p>
     <w:p>
@@ -1273,6 +1273,7 @@
         <w:rPr>
           <w:i/>
           <w:iCs/>
+          <w:noProof/>
         </w:rPr>
         <w:drawing>
           <wp:inline distT="0" distB="0" distL="0" distR="0" wp14:anchorId="01370FFD" wp14:editId="469F81EA">
@@ -1367,6 +1368,7 @@
         <w:rPr>
           <w:i/>
           <w:iCs/>
+          <w:noProof/>
         </w:rPr>
         <w:lastRenderedPageBreak/>
         <w:drawing>
@@ -1412,6 +1414,9 @@
         <w:t xml:space="preserve"> </w:t>
       </w:r>
       <w:r>
+        <w:rPr>
+          <w:noProof/>
+        </w:rPr>
         <w:drawing>
           <wp:inline distT="0" distB="0" distL="0" distR="0" wp14:anchorId="1140C46F" wp14:editId="5400072C">
             <wp:extent cx="3124200" cy="697230"/>
@@ -1574,6 +1579,9 @@
         <w:spacing w:before="70" w:after="70"/>
       </w:pPr>
       <w:r>
+        <w:rPr>
+          <w:noProof/>
+        </w:rPr>
         <w:drawing>
           <wp:inline distT="0" distB="0" distL="0" distR="0" wp14:anchorId="39D29706" wp14:editId="087F32A5">
             <wp:extent cx="3124200" cy="545465"/>
@@ -1617,6 +1625,9 @@
         <w:t xml:space="preserve"> </w:t>
       </w:r>
       <w:r>
+        <w:rPr>
+          <w:noProof/>
+        </w:rPr>
         <w:drawing>
           <wp:inline distT="0" distB="0" distL="0" distR="0" wp14:anchorId="10490DD4" wp14:editId="601E7099">
             <wp:extent cx="3124200" cy="478790"/>
@@ -1719,6 +1730,7 @@
         <w:rPr>
           <w:i/>
           <w:iCs/>
+          <w:noProof/>
         </w:rPr>
         <w:drawing>
           <wp:inline distT="0" distB="0" distL="0" distR="0" wp14:anchorId="0A54754C" wp14:editId="419E8BB7">
@@ -1781,6 +1793,7 @@
         <w:rPr>
           <w:i/>
           <w:iCs/>
+          <w:noProof/>
         </w:rPr>
         <w:drawing>
           <wp:inline distT="0" distB="0" distL="0" distR="0" wp14:anchorId="4BF1A40D" wp14:editId="6E3C2DC4">
@@ -1859,6 +1872,7 @@
         <w:rPr>
           <w:i/>
           <w:iCs/>
+          <w:noProof/>
         </w:rPr>
         <w:drawing>
           <wp:inline distT="0" distB="0" distL="0" distR="0" wp14:anchorId="519DC348" wp14:editId="1BDC5DDE">
@@ -2388,10 +2402,16 @@
             <w:vAlign w:val="center"/>
           </w:tcPr>
           <w:p>
-            <w:r>
-              <w:rPr>
-                <w:sz w:val="16"/>
-                <w:szCs w:val="16"/>
+            <w:pPr>
+              <w:rPr>
+                <w:highlight w:val="yellow"/>
+              </w:rPr>
+            </w:pPr>
+            <w:r>
+              <w:rPr>
+                <w:sz w:val="16"/>
+                <w:szCs w:val="16"/>
+                <w:highlight w:val="yellow"/>
               </w:rPr>
               <w:t>Baseline</w:t>
             </w:r>
@@ -2403,10 +2423,16 @@
             <w:vAlign w:val="center"/>
           </w:tcPr>
           <w:p>
-            <w:r>
-              <w:rPr>
-                <w:sz w:val="16"/>
-                <w:szCs w:val="16"/>
+            <w:pPr>
+              <w:rPr>
+                <w:highlight w:val="yellow"/>
+              </w:rPr>
+            </w:pPr>
+            <w:r>
+              <w:rPr>
+                <w:sz w:val="16"/>
+                <w:szCs w:val="16"/>
+                <w:highlight w:val="yellow"/>
               </w:rPr>
               <w:t>86,945</w:t>
             </w:r>
@@ -2418,10 +2444,16 @@
             <w:vAlign w:val="center"/>
           </w:tcPr>
           <w:p>
-            <w:r>
-              <w:rPr>
-                <w:sz w:val="16"/>
-                <w:szCs w:val="16"/>
+            <w:pPr>
+              <w:rPr>
+                <w:highlight w:val="yellow"/>
+              </w:rPr>
+            </w:pPr>
+            <w:r>
+              <w:rPr>
+                <w:sz w:val="16"/>
+                <w:szCs w:val="16"/>
+                <w:highlight w:val="yellow"/>
               </w:rPr>
               <w:t>3.898</w:t>
             </w:r>
@@ -2433,10 +2465,16 @@
             <w:vAlign w:val="center"/>
           </w:tcPr>
           <w:p>
-            <w:r>
-              <w:rPr>
-                <w:sz w:val="16"/>
-                <w:szCs w:val="16"/>
+            <w:pPr>
+              <w:rPr>
+                <w:highlight w:val="yellow"/>
+              </w:rPr>
+            </w:pPr>
+            <w:r>
+              <w:rPr>
+                <w:sz w:val="16"/>
+                <w:szCs w:val="16"/>
+                <w:highlight w:val="yellow"/>
               </w:rPr>
               <w:t>17.15</w:t>
             </w:r>
@@ -2448,10 +2486,16 @@
             <w:vAlign w:val="center"/>
           </w:tcPr>
           <w:p>
-            <w:r>
-              <w:rPr>
-                <w:sz w:val="16"/>
-                <w:szCs w:val="16"/>
+            <w:pPr>
+              <w:rPr>
+                <w:highlight w:val="yellow"/>
+              </w:rPr>
+            </w:pPr>
+            <w:r>
+              <w:rPr>
+                <w:sz w:val="16"/>
+                <w:szCs w:val="16"/>
+                <w:highlight w:val="yellow"/>
               </w:rPr>
               <w:t>59.33</w:t>
             </w:r>
@@ -2463,10 +2507,16 @@
             <w:vAlign w:val="center"/>
           </w:tcPr>
           <w:p>
-            <w:r>
-              <w:rPr>
-                <w:sz w:val="16"/>
-                <w:szCs w:val="16"/>
+            <w:pPr>
+              <w:rPr>
+                <w:highlight w:val="yellow"/>
+              </w:rPr>
+            </w:pPr>
+            <w:r>
+              <w:rPr>
+                <w:sz w:val="16"/>
+                <w:szCs w:val="16"/>
+                <w:highlight w:val="yellow"/>
               </w:rPr>
               <w:t>40.4</w:t>
             </w:r>
@@ -2480,10 +2530,16 @@
             <w:vAlign w:val="center"/>
           </w:tcPr>
           <w:p>
-            <w:r>
-              <w:rPr>
-                <w:sz w:val="16"/>
-                <w:szCs w:val="16"/>
+            <w:pPr>
+              <w:rPr>
+                <w:highlight w:val="yellow"/>
+              </w:rPr>
+            </w:pPr>
+            <w:r>
+              <w:rPr>
+                <w:sz w:val="16"/>
+                <w:szCs w:val="16"/>
+                <w:highlight w:val="yellow"/>
               </w:rPr>
               <w:t>Full</w:t>
             </w:r>
@@ -2495,10 +2551,16 @@
             <w:vAlign w:val="center"/>
           </w:tcPr>
           <w:p>
-            <w:r>
-              <w:rPr>
-                <w:sz w:val="16"/>
-                <w:szCs w:val="16"/>
+            <w:pPr>
+              <w:rPr>
+                <w:highlight w:val="yellow"/>
+              </w:rPr>
+            </w:pPr>
+            <w:r>
+              <w:rPr>
+                <w:sz w:val="16"/>
+                <w:szCs w:val="16"/>
+                <w:highlight w:val="yellow"/>
               </w:rPr>
               <w:t>116,138</w:t>
             </w:r>
@@ -2510,10 +2572,16 @@
             <w:vAlign w:val="center"/>
           </w:tcPr>
           <w:p>
-            <w:r>
-              <w:rPr>
-                <w:sz w:val="16"/>
-                <w:szCs w:val="16"/>
+            <w:pPr>
+              <w:rPr>
+                <w:highlight w:val="yellow"/>
+              </w:rPr>
+            </w:pPr>
+            <w:r>
+              <w:rPr>
+                <w:sz w:val="16"/>
+                <w:szCs w:val="16"/>
+                <w:highlight w:val="yellow"/>
               </w:rPr>
               <w:t>4.844</w:t>
             </w:r>
@@ -2525,10 +2593,16 @@
             <w:vAlign w:val="center"/>
           </w:tcPr>
           <w:p>
-            <w:r>
-              <w:rPr>
-                <w:sz w:val="16"/>
-                <w:szCs w:val="16"/>
+            <w:pPr>
+              <w:rPr>
+                <w:highlight w:val="yellow"/>
+              </w:rPr>
+            </w:pPr>
+            <w:r>
+              <w:rPr>
+                <w:sz w:val="16"/>
+                <w:szCs w:val="16"/>
+                <w:highlight w:val="yellow"/>
               </w:rPr>
               <w:t>15.35</w:t>
             </w:r>
@@ -2540,10 +2614,16 @@
             <w:vAlign w:val="center"/>
           </w:tcPr>
           <w:p>
-            <w:r>
-              <w:rPr>
-                <w:sz w:val="16"/>
-                <w:szCs w:val="16"/>
+            <w:pPr>
+              <w:rPr>
+                <w:highlight w:val="yellow"/>
+              </w:rPr>
+            </w:pPr>
+            <w:r>
+              <w:rPr>
+                <w:sz w:val="16"/>
+                <w:szCs w:val="16"/>
+                <w:highlight w:val="yellow"/>
               </w:rPr>
               <w:t>54.89</w:t>
             </w:r>
@@ -2555,10 +2635,16 @@
             <w:vAlign w:val="center"/>
           </w:tcPr>
           <w:p>
-            <w:r>
-              <w:rPr>
-                <w:sz w:val="16"/>
-                <w:szCs w:val="16"/>
+            <w:pPr>
+              <w:rPr>
+                <w:highlight w:val="yellow"/>
+              </w:rPr>
+            </w:pPr>
+            <w:r>
+              <w:rPr>
+                <w:sz w:val="16"/>
+                <w:szCs w:val="16"/>
+                <w:highlight w:val="yellow"/>
               </w:rPr>
               <w:t>47.1</w:t>
             </w:r>
@@ -5318,16 +5404,7 @@
           <w:sz w:val="22"/>
           <w:szCs w:val="22"/>
         </w:rPr>
-        <w:t xml:space="preserve">                             </w:t>
-      </w:r>
-      <w:r>
-        <w:rPr>
-          <w:b/>
-          <w:bCs/>
-          <w:sz w:val="22"/>
-          <w:szCs w:val="22"/>
-        </w:rPr>
-        <w:t>REFERENCES</w:t>
+        <w:t xml:space="preserve">                             REFERENCES</w:t>
       </w:r>
     </w:p>
     <w:p>

</xml_diff>